<commit_message>
docs: GTM strategy v2 + research + roast + Ground Zero refresh
Adds the canonical gtm-strategy.md (solo-first wedge, $99-149 price test,
registration-window watchlist as retention), gtm-research.md, the 5-persona
adversarial roast (mvp-idea-roast.md), and gtm-research-expansion.md (the
5-vertical Activity OS brief that seeds the one-agent-five-doors plan).
Refreshes roadmap.md (Architectural Infra section absorbs the closed infra
plan) and system-architecture.md.

Co-Authored-By: Claude Fable 5 <noreply@anthropic.com>
</commit_message>
<xml_diff>
--- a/docs/GTM/MVP-Ground-Zero.docx
+++ b/docs/GTM/MVP-Ground-Zero.docx
@@ -58,7 +58,7 @@
           <w:color w:val="6F6A60"/>
           <w:sz w:val="22"/>
         </w:rPr>
-        <w:t>June 2026</w:t>
+        <w:t>June 2026 · revised July 2026</w:t>
         <w:br/>
         <w:t>Miguel Alvarado, Heather Hannan-Kramer, Greg Harris</w:t>
       </w:r>
@@ -198,6 +198,17 @@
       </w:r>
     </w:p>
     <w:p>
+      <w:pPr>
+        <w:spacing w:after="80"/>
+      </w:pPr>
+      <w:r>
+        <w:rPr>
+          <w:color w:val="4F5D3A"/>
+        </w:rPr>
+        <w:t>12. Go-To-Market Strategy</w:t>
+      </w:r>
+    </w:p>
+    <w:p>
       <w:r>
         <w:br w:type="page"/>
       </w:r>
@@ -721,7 +732,7 @@
         <w:t xml:space="preserve">Onboarding. </w:t>
       </w:r>
       <w:r>
-        <w:t>A multi-step flow that learns about the parent and their children. Collects name, kid names/ages, parenting philosophy, challenges, location, cultural background. Two paths: structured form or conversational chat with the AI.</w:t>
+        <w:t>A multi-step flow that learns about the parent and their children. Collects name, kid names/ages, parenting philosophy, challenges, location, cultural background. Two paths: structured form or conversational chat with the AI. Hardened after real beta-family incidents so a fresh install can never silently lose a family's answers.</w:t>
       </w:r>
     </w:p>
     <w:p>
@@ -732,7 +743,7 @@
         <w:t xml:space="preserve">Parent coaching agent. </w:t>
       </w:r>
       <w:r>
-        <w:t>An AI assistant that remembers your family, adapts to your parenting style, and gives concrete, actionable advice. Not generic—it knows your kid's age band, your co-parenting situation, your stressors.</w:t>
+        <w:t>An AI assistant that remembers your family, adapts to your parenting style, and gives concrete, actionable advice. Not generic—it knows your kid's age band, your co-parenting situation, your stressors. Works by text or real-time voice.</w:t>
       </w:r>
     </w:p>
     <w:p>
@@ -769,6 +780,39 @@
       </w:r>
     </w:p>
     <w:p>
+      <w:r>
+        <w:rPr>
+          <w:b/>
+        </w:rPr>
+        <w:t xml:space="preserve">The Plan tab. </w:t>
+      </w:r>
+      <w:r>
+        <w:t>A fifth tab, chat-first: the home of the family chief of staff (detailed below)—Chat, Discover, Shortlist, and Calendar in one place, plus "add from a message or photo" ingestion.</w:t>
+      </w:r>
+    </w:p>
+    <w:p>
+      <w:r>
+        <w:rPr>
+          <w:b/>
+        </w:rPr>
+        <w:t xml:space="preserve">Settings &amp; profile control. </w:t>
+      </w:r>
+      <w:r>
+        <w:t>A full settings hub: edit everything the system knows about you and each kid, review the family-wide "what we've learned" profile, add or delete a kid profile (with complete data cleanup), and connect or disconnect Google accounts.</w:t>
+      </w:r>
+    </w:p>
+    <w:p>
+      <w:r>
+        <w:rPr>
+          <w:b/>
+        </w:rPr>
+        <w:t xml:space="preserve">In-app debug reporting. </w:t>
+      </w:r>
+      <w:r>
+        <w:t>One tap sends diagnostics to the team—how beta families report issues without leaving the app.</w:t>
+      </w:r>
+    </w:p>
+    <w:p>
       <w:pPr>
         <w:pStyle w:val="Heading2"/>
       </w:pPr>
@@ -784,7 +828,7 @@
         <w:t xml:space="preserve">AI agent pipeline. </w:t>
       </w:r>
       <w:r>
-        <w:t>Powered by OpenAI's latest model (GPT-5.2). Each kid companion runs through a multi-stage pipeline: prompt synthesis (builds the system prompt from the parent's letter + kid profile), then streams responses through a real-time moderation pipeline.</w:t>
+        <w:t>Powered by OpenAI's latest model (GPT-5.5). Each kid companion runs through a multi-stage pipeline: prompt synthesis (builds the system prompt from the parent's letter + kid profile), then streams responses through a real-time moderation pipeline.</w:t>
       </w:r>
     </w:p>
     <w:p>
@@ -814,10 +858,10 @@
         <w:rPr>
           <w:b/>
         </w:rPr>
-        <w:t xml:space="preserve">Voice pipeline (v2 in progress). </w:t>
-      </w:r>
-      <w:r>
-        <w:t>Real-time voice via ElevenLabs Conversational AI. WebRTC audio—under 150ms latency from the child speaking to the companion responding. The child just talks; no typing required.</w:t>
+        <w:t xml:space="preserve">Voice pipeline (v2 — shipped). </w:t>
+      </w:r>
+      <w:r>
+        <w:t>Real-time voice via ElevenLabs Conversational AI, live for both kid companions and the parent coach. WebRTC audio—under 150ms latency from the child speaking to the companion responding. The child just talks; no typing required.</w:t>
       </w:r>
     </w:p>
     <w:p>
@@ -839,7 +883,7 @@
         <w:t xml:space="preserve">Content management system. </w:t>
       </w:r>
       <w:r>
-        <w:t>A web-based editor for creating and organizing articles, categories, and community posts. Used internally to manage the content library.</w:t>
+        <w:t>A web-based editor for creating and organizing articles, categories, and community posts, plus admin controls for the background agents (email-sync and calendar-sync schedules, run history). Used internally.</w:t>
       </w:r>
     </w:p>
     <w:p>
@@ -847,12 +891,123 @@
         <w:pStyle w:val="Heading2"/>
       </w:pPr>
       <w:r>
+        <w:t>The family chief of staff (shipped since the June meeting)</w:t>
+      </w:r>
+    </w:p>
+    <w:p>
+      <w:r>
+        <w:t>The "parenting agenda manager" that Section 8 of the June draft described as our next major feature is now built, deployed to production, and validated with real family data. It is the operational half of the product—and, per Section 12, the centerpiece of our go-to-market. What exists today:</w:t>
+      </w:r>
+    </w:p>
+    <w:p>
+      <w:r>
+        <w:rPr>
+          <w:b/>
+        </w:rPr>
+        <w:t xml:space="preserve">Activity discovery agent. </w:t>
+      </w:r>
+      <w:r>
+        <w:t>A background research agent that finds real camps and activities near you—filtered by radius and a free-form focus ("art camps only"), scored against each kid's age and interests, with a live progress feed while it searches. Asks for the top N but reviews a much larger pool behind the scenes.</w:t>
+      </w:r>
+    </w:p>
+    <w:p>
+      <w:r>
+        <w:rPr>
+          <w:b/>
+        </w:rPr>
+        <w:t xml:space="preserve">Chief-of-staff chat. </w:t>
+      </w:r>
+      <w:r>
+        <w:t>A conversational agent with 19 working tools: it compares shortlisted options ("help me decide"—cost, age eligibility, schedule conflicts, coverage gaps across kids and weeks), tracks decisions with rationale, manages to-dos, drafts emails to camp directors (never sends), looks up and saves camps you already registered for, and can kick off new discovery runs mid-conversation.</w:t>
+      </w:r>
+    </w:p>
+    <w:p>
+      <w:r>
+        <w:rPr>
+          <w:b/>
+        </w:rPr>
+        <w:t xml:space="preserve">Flyer and message ingestion. </w:t>
+      </w:r>
+      <w:r>
+        <w:t>Paste a text message or snap a photo of a paper flyer; the vision pipeline extracts the activity, tracks it, adds calendar entries, and spawns the follow-up to-dos (confirm eligibility, pay the fee).</w:t>
+      </w:r>
+    </w:p>
+    <w:p>
+      <w:r>
+        <w:rPr>
+          <w:b/>
+        </w:rPr>
+        <w:t xml:space="preserve">Gmail agent. </w:t>
+      </w:r>
+      <w:r>
+        <w:t>With permission (Google OAuth, shipped end-to-end), a daily agent reads camp-related email for registered activities and turns it into calendar entries and tasks.</w:t>
+      </w:r>
+    </w:p>
+    <w:p>
+      <w:r>
+        <w:rPr>
+          <w:b/>
+        </w:rPr>
+        <w:t xml:space="preserve">Two-way Google Calendar sync. </w:t>
+      </w:r>
+      <w:r>
+        <w:t>The family plan lives where parents already look. Pulls external events in; pushes plan entries out.</w:t>
+      </w:r>
+    </w:p>
+    <w:p>
+      <w:r>
+        <w:rPr>
+          <w:b/>
+        </w:rPr>
+        <w:t xml:space="preserve">The Plan hub. </w:t>
+      </w:r>
+      <w:r>
+        <w:t>A chat-first iOS tab—Chat, Discover, Shortlist, Calendar—plus a full parent web dashboard (login, discovery, week-by-kid calendar with cost and coverage callouts, to-dos, chat) served from the same backend.</w:t>
+      </w:r>
+    </w:p>
+    <w:p>
+      <w:r>
+        <w:rPr>
+          <w:b/>
+        </w:rPr>
+        <w:t xml:space="preserve">Profile editing everywhere. </w:t>
+      </w:r>
+      <w:r>
+        <w:t>Parents can view and edit everything the system knows—about themselves, each kid, and the family-wide "what we've learned" profile—on iOS and web, including adding and deleting kid profiles with full data cleanup.</w:t>
+      </w:r>
+    </w:p>
+    <w:p>
+      <w:r>
+        <w:rPr>
+          <w:b/>
+        </w:rPr>
+        <w:t xml:space="preserve">Production hardening. </w:t>
+      </w:r>
+      <w:r>
+        <w:t>Error tracking (Sentry), metrics dashboards (Grafana), cost logging per AI call, concurrency fixes proven under fault injection, and guardrail tests for the bug classes our beta families actually hit.</w:t>
+      </w:r>
+    </w:p>
+    <w:p>
+      <w:pPr>
+        <w:pStyle w:val="Heading2"/>
+      </w:pPr>
+      <w:r>
         <w:t>What works end-to-end today</w:t>
       </w:r>
     </w:p>
     <w:p>
       <w:r>
         <w:t>A parent can onboard, set up a kid companion, write a letter defining boundaries, hand the phone to their child, and the child can have a voice conversation with their AI companion—all moderated in real time, with transcripts visible to the parent. This is not a mockup. It runs.</w:t>
+      </w:r>
+    </w:p>
+    <w:p>
+      <w:r>
+        <w:t>And on the logistics side: a parent can ask for summer camps near them, watch real options stream in scored to each kid's age, save a shortlist, ask the chief of staff to compare them, snap a photo of a flyer from the school backpack, and see all of it land on a calendar that syncs with Google—live in production today.</w:t>
+      </w:r>
+    </w:p>
+    <w:p>
+      <w:r>
+        <w:t>None of this is demo-ware: real beta families use the production system today, and their bug reports have already driven hardening rounds (data-durability fixes, profile-edit cleanups, guardrail tests) that made the product sturdier than any internal testing could.</w:t>
       </w:r>
     </w:p>
     <w:p>
@@ -1351,10 +1506,10 @@
         <w:rPr>
           <w:b/>
         </w:rPr>
-        <w:t xml:space="preserve">Voice v2 (in progress). </w:t>
-      </w:r>
-      <w:r>
-        <w:t>Complete the ElevenLabs Conversational AI integration. Sub-150ms latency voice for kid companions. Currently 80% done—backend complete, iOS SDK integrated, wiring into the view layer is the remaining work.</w:t>
+        <w:t xml:space="preserve">TestFlight release of the new experience. </w:t>
+      </w:r>
+      <w:r>
+        <w:t>The chat-first Plan hub, the profile editor, calendar sync, and the Connect-Gmail flow are built and verified—they ship to beta families with the next TestFlight build.</w:t>
       </w:r>
     </w:p>
     <w:p>
@@ -1395,62 +1550,25 @@
         <w:pStyle w:val="Heading2"/>
       </w:pPr>
       <w:r>
-        <w:t>The parenting agenda manager (next major feature)</w:t>
-      </w:r>
-    </w:p>
-    <w:p>
-      <w:r>
-        <w:t>This is the second pillar of the product after the companion agents. Where the coaching agent helps you think, the agenda manager helps you act. It's the agent that makes sure nothing falls through the cracks.</w:t>
-      </w:r>
-    </w:p>
-    <w:p>
-      <w:r>
-        <w:rPr>
-          <w:b/>
-        </w:rPr>
-        <w:t xml:space="preserve">Proactive discovery. </w:t>
-      </w:r>
-      <w:r>
-        <w:t>Scans for upcoming camps (summer, winter, spring break), classes, events, and activities relevant to each child—based on their age, interests, and your location. Surfaces options before registration deadlines close, not after.</w:t>
-      </w:r>
-    </w:p>
-    <w:p>
-      <w:r>
-        <w:rPr>
-          <w:b/>
-        </w:rPr>
-        <w:t xml:space="preserve">Email and message extraction. </w:t>
-      </w:r>
-      <w:r>
-        <w:t>With permission, reads the parent's email and text messages to find event information that's already there: school newsletters with dates, coach emails with practice schedules, camp confirmations with packing lists, permission slips with deadlines. Pulls the signal out of the noise.</w:t>
-      </w:r>
-    </w:p>
-    <w:p>
-      <w:r>
-        <w:rPr>
-          <w:b/>
-        </w:rPr>
-        <w:t xml:space="preserve">Family calendar. </w:t>
-      </w:r>
-      <w:r>
-        <w:t>Builds a unified calendar for the whole family—every kid's activities in one view. Syncs to Google Calendar so it lives where the parent already looks. No separate app to check.</w:t>
-      </w:r>
-    </w:p>
-    <w:p>
-      <w:r>
-        <w:rPr>
-          <w:b/>
-        </w:rPr>
-        <w:t xml:space="preserve">Reminders and to-dos. </w:t>
-      </w:r>
-      <w:r>
-        <w:t>Manages the invisible labor: "Soccer registration closes Friday." "Pack sunscreen for field trip Monday." "Submit immunization form by the 15th." The kind of tasks that live in a parent's head rent-free until they're missed.</w:t>
-      </w:r>
-    </w:p>
-    <w:p/>
-    <w:p>
-      <w:r>
-        <w:t>This is the "Superhuman for family scheduling" concept—but smarter, because it knows your family profile. It doesn't suggest teen coding camp for your 4-year-old. It doesn't remind you about a deadline that's already passed. It acts like the hyper-organized parent friend who somehow always knows what's coming up and texts you "hey, did you sign up for X yet?"</w:t>
+        <w:t>The parenting agenda manager — shipped</w:t>
+      </w:r>
+    </w:p>
+    <w:p>
+      <w:r>
+        <w:t>The June draft described this as our next major feature. It is now built and live in production—see "The family chief of staff" in Section 5. It became the "Superhuman for family scheduling" we sketched, and smarter than the sketch: it doesn't suggest teen coding camp for your 4-year-old, and it acts like the hyper-organized parent friend who texts you "hey, did you sign up for X yet?" What changed since June is the strategy around it: our market research (Section 12) concluded that this—not the coaching or the companions—is the front door of the business.</w:t>
+      </w:r>
+    </w:p>
+    <w:p>
+      <w:pPr>
+        <w:pStyle w:val="Heading2"/>
+      </w:pPr>
+      <w:r>
+        <w:t>The next unit of work is validation, not features</w:t>
+      </w:r>
+    </w:p>
+    <w:p>
+      <w:r>
+        <w:t>The honest diagnosis from our July research: we have built a polished platform in silence, with zero waitlist and zero demand signal—the number-one founder mistake in every playbook we studied. The platform is over-built for a beta. Before greenlighting significant new feature work, we run the validation funnel described in Section 12 and let real market data pick our headline.</w:t>
       </w:r>
     </w:p>
     <w:p>
@@ -1518,15 +1636,7 @@
         <w:pStyle w:val="ListBullet"/>
       </w:pPr>
       <w:r>
-        <w:t>Go-to-market strategy and growth channels</w:t>
-      </w:r>
-    </w:p>
-    <w:p>
-      <w:pPr>
-        <w:pStyle w:val="ListBullet"/>
-      </w:pPr>
-      <w:r>
-        <w:t>COPPA compliance (required for public launch if under-13 audience)</w:t>
+        <w:t>COPPA compliance build-out (the amended rule is now in force — see Section 12; required before any public kid-facing launch)</w:t>
       </w:r>
     </w:p>
     <w:p>
@@ -1882,6 +1992,18 @@
     <w:p>
       <w:r>
         <w:t>The following is a structured overview of the addressable market for an AI-powered family companion. This data supports GTM planning and investor conversations.</w:t>
+      </w:r>
+    </w:p>
+    <w:p>
+      <w:r>
+        <w:rPr>
+          <w:b/>
+          <w:color w:val="3A4A2A"/>
+        </w:rPr>
+        <w:t xml:space="preserve">July 2026 refresh. </w:t>
+      </w:r>
+      <w:r>
+        <w:t>A full deep-research pass (two companion documents in the GTM folder: the market research report and its activity-portfolio expansion) sharpened this picture with sourced proof-of-budget numbers: Good Inside (Dr. Becky) passed $34M revenue in 2025 with 100,000+ subscribers at ~$276/yr; OurFamilyWizard serves ~1M+ families at $150–300 per parent per year (often court-mandated); Skylight reports 9.3M users and 99% year-over-year revenue growth; the average sports family spends ~$1,000+ per child per year and 25% of camp parents planned to spend over $2,000 per child in 2025. The co-parenting segment is projected to be the fastest-growing slice of the parenting-app market. Those documents supersede the estimates below where they conflict; the figures in this section are kept for continuity.</w:t>
       </w:r>
     </w:p>
     <w:p>
@@ -2539,6 +2661,632 @@
         </w:pBdr>
       </w:pPr>
     </w:p>
+    <w:p>
+      <w:pPr>
+        <w:pStyle w:val="Heading1"/>
+      </w:pPr>
+      <w:r>
+        <w:t>12. Go-To-Market Strategy</w:t>
+      </w:r>
+    </w:p>
+    <w:p>
+      <w:r>
+        <w:t>Added July 2026; revised after a five-persona adversarial review of the strategy (verdict: reshape) plus a verification research pass. The full evidence trail lives alongside this document in the GTM folder — gtm-strategy.md is the canonical version of what follows. The strategy in one sentence: lead with one acute, seasonal logistics pain for one sharp audience — designed so it delivers full value even when only ONE parent participates — retain with the always-on ingestion loop and the registration-window watchlist, and validate demand with a funnel before building anything else.</w:t>
+      </w:r>
+    </w:p>
+    <w:p>
+      <w:pPr>
+        <w:pStyle w:val="Heading2"/>
+      </w:pPr>
+      <w:r>
+        <w:t>The wedge</w:t>
+      </w:r>
+    </w:p>
+    <w:p>
+      <w:r>
+        <w:t>We cannot market a platform; strangers buy a fix for the one pain they feel today. Our entry point—the wedge—is activity and camp logistics for the load-bearing parent in a two-household family. It is acute (85% of parents report losing sleep over summer care and scheduling; 90% among working parents — Bright Horizons 2026 Modern Family Index), seasonal (predictable registration panics), budgeted (separated parents already accept $150–300/parent/yr for court-mandated co-parenting apps), and authentic (Miguel is the customer). Crucially, the product is SOLO-FIRST: one parent gets full value alone, and the other parent participates at zero friction—plain calendar invites and a magic forwarding email address, never an app install, never an account, never a charge. Retention comes from the always-on ingestion loop (school emails, flyers, registrations) and from watching registration windows—the product re-arms every season.</w:t>
+      </w:r>
+    </w:p>
+    <w:p>
+      <w:pPr>
+        <w:pStyle w:val="Heading3"/>
+      </w:pPr>
+      <w:r>
+        <w:t>Positioning statement</w:t>
+      </w:r>
+    </w:p>
+    <w:p>
+      <w:r>
+        <w:rPr>
+          <w:i/>
+        </w:rPr>
+        <w:t>For the parent who carries the logistics of raising kids across two households, MVP is the AI chief-of-staff that finds the camps, watches the registration windows, turns flyers and school emails into both homes' calendars, and warns you before a coverage gap becomes a fight—and it works even when only one of you uses it. Unlike OurFamilyWizard and TalkingParents, which document conflict for court, MVP prevents it; unlike ChatGPT, it knows your family, your custody rhythm, and your deadlines.</w:t>
+      </w:r>
+    </w:p>
+    <w:p>
+      <w:pPr>
+        <w:pStyle w:val="Heading3"/>
+      </w:pPr>
+      <w:r>
+        <w:t>Why not lead with the coach or the companions</w:t>
+      </w:r>
+    </w:p>
+    <w:p>
+      <w:r>
+        <w:t>"An AI that gives parenting advice" is ChatGPT with extra steps—Milo, a better-funded, OpenAI-endorsed family AI copilot, shut down in January 2026 in exactly that squeeze ("the technology is simply too early to be reliable in any useful way" — its founder's farewell post), and Good Inside already owns the coaching brand position. Worse, for OUR buyer the coach is a liability before it's a hook: AI chat logs carry no legal privilege and are discoverable in custody litigation, so a separated parent will not confide in a coach whose transcripts could surface in court. The coach therefore stays in the product as a supporting feature and out of the marketing until its zero-retention privacy architecture ships (see regulatory posture below). Our defensible moats are what generic AI structurally cannot do: a persistent family profile, agentic work (camp research, registration watching, flyer-to-calendar, Gmail and calendar sync), and two-household coordination.</w:t>
+      </w:r>
+    </w:p>
+    <w:p>
+      <w:pPr>
+        <w:pStyle w:val="Heading2"/>
+      </w:pPr>
+      <w:r>
+        <w:t>From camp planner to Activity OS (solving seasonality)</w:t>
+      </w:r>
+    </w:p>
+    <w:p>
+      <w:r>
+        <w:t>Camp planning alone is a January–April business. The expansion research reframes it as one instance of a repeating job—discover, decide, register, coordinate the things my kids do—across five verticals that chain into a year-round relay. The engine we built (discovery agent, fit scoring, flyer vision, Gmail reading, calendar sync) is activity-type-agnostic; only the marketing entry point rotates.</w:t>
+      </w:r>
+    </w:p>
+    <w:tbl>
+      <w:tblPr>
+        <w:tblStyle w:val="TableGrid"/>
+        <w:tblW w:type="auto" w:w="0"/>
+        <w:tblLook w:firstColumn="1" w:firstRow="1" w:lastColumn="0" w:lastRow="0" w:noHBand="0" w:noVBand="1" w:val="04A0"/>
+      </w:tblPr>
+      <w:tblGrid>
+        <w:gridCol w:w="2946"/>
+        <w:gridCol w:w="2946"/>
+        <w:gridCol w:w="2946"/>
+      </w:tblGrid>
+      <w:tr>
+        <w:tc>
+          <w:tcPr>
+            <w:tcW w:type="dxa" w:w="2946"/>
+            <w:shd w:fill="E8EBDC" w:val="clear"/>
+          </w:tcPr>
+          <w:p>
+            <w:r>
+              <w:rPr>
+                <w:b/>
+                <w:sz w:val="18"/>
+              </w:rPr>
+              <w:t>Vertical</w:t>
+            </w:r>
+          </w:p>
+        </w:tc>
+        <w:tc>
+          <w:tcPr>
+            <w:tcW w:type="dxa" w:w="2946"/>
+            <w:shd w:fill="E8EBDC" w:val="clear"/>
+          </w:tcPr>
+          <w:p>
+            <w:r>
+              <w:rPr>
+                <w:b/>
+                <w:sz w:val="18"/>
+              </w:rPr>
+              <w:t>Rhythm</w:t>
+            </w:r>
+          </w:p>
+        </w:tc>
+        <w:tc>
+          <w:tcPr>
+            <w:tcW w:type="dxa" w:w="2946"/>
+            <w:shd w:fill="E8EBDC" w:val="clear"/>
+          </w:tcPr>
+          <w:p>
+            <w:r>
+              <w:rPr>
+                <w:b/>
+                <w:sz w:val="18"/>
+              </w:rPr>
+              <w:t>Role</w:t>
+            </w:r>
+          </w:p>
+        </w:tc>
+      </w:tr>
+      <w:tr>
+        <w:tc>
+          <w:tcPr>
+            <w:tcW w:type="dxa" w:w="2946"/>
+          </w:tcPr>
+          <w:p>
+            <w:r>
+              <w:rPr>
+                <w:sz w:val="18"/>
+              </w:rPr>
+              <w:t>Camps + school-break coverage</w:t>
+            </w:r>
+          </w:p>
+        </w:tc>
+        <w:tc>
+          <w:tcPr>
+            <w:tcW w:type="dxa" w:w="2946"/>
+          </w:tcPr>
+          <w:p>
+            <w:r>
+              <w:rPr>
+                <w:sz w:val="18"/>
+              </w:rPr>
+              <w:t>3–4 acute episodes/yr</w:t>
+            </w:r>
+          </w:p>
+        </w:tc>
+        <w:tc>
+          <w:tcPr>
+            <w:tcW w:type="dxa" w:w="2946"/>
+          </w:tcPr>
+          <w:p>
+            <w:r>
+              <w:rPr>
+                <w:sz w:val="18"/>
+              </w:rPr>
+              <w:t>The anchor and launch wedge</w:t>
+            </w:r>
+          </w:p>
+        </w:tc>
+      </w:tr>
+      <w:tr>
+        <w:tc>
+          <w:tcPr>
+            <w:tcW w:type="dxa" w:w="2946"/>
+          </w:tcPr>
+          <w:p>
+            <w:r>
+              <w:rPr>
+                <w:sz w:val="18"/>
+              </w:rPr>
+              <w:t>Extracurriculars &amp; youth sports</w:t>
+            </w:r>
+          </w:p>
+        </w:tc>
+        <w:tc>
+          <w:tcPr>
+            <w:tcW w:type="dxa" w:w="2946"/>
+          </w:tcPr>
+          <w:p>
+            <w:r>
+              <w:rPr>
+                <w:sz w:val="18"/>
+              </w:rPr>
+              <w:t>Weekly + 2 enrollment seasons</w:t>
+            </w:r>
+          </w:p>
+        </w:tc>
+        <w:tc>
+          <w:tcPr>
+            <w:tcW w:type="dxa" w:w="2946"/>
+          </w:tcPr>
+          <w:p>
+            <w:r>
+              <w:rPr>
+                <w:sz w:val="18"/>
+              </w:rPr>
+              <w:t>Highest family spend; makes it a weekly habit</w:t>
+            </w:r>
+          </w:p>
+        </w:tc>
+      </w:tr>
+      <w:tr>
+        <w:tc>
+          <w:tcPr>
+            <w:tcW w:type="dxa" w:w="2946"/>
+          </w:tcPr>
+          <w:p>
+            <w:r>
+              <w:rPr>
+                <w:sz w:val="18"/>
+              </w:rPr>
+              <w:t>School life (emails, flyers, permission slips)</w:t>
+            </w:r>
+          </w:p>
+        </w:tc>
+        <w:tc>
+          <w:tcPr>
+            <w:tcW w:type="dxa" w:w="2946"/>
+          </w:tcPr>
+          <w:p>
+            <w:r>
+              <w:rPr>
+                <w:sz w:val="18"/>
+              </w:rPr>
+              <w:t>Daily in school year</w:t>
+            </w:r>
+          </w:p>
+        </w:tc>
+        <w:tc>
+          <w:tcPr>
+            <w:tcW w:type="dxa" w:w="2946"/>
+          </w:tcPr>
+          <w:p>
+            <w:r>
+              <w:rPr>
+                <w:sz w:val="18"/>
+              </w:rPr>
+              <w:t>The sleeper: 80+ school emails/mo; our ingestion pipeline already does this for camps</w:t>
+            </w:r>
+          </w:p>
+        </w:tc>
+      </w:tr>
+      <w:tr>
+        <w:tc>
+          <w:tcPr>
+            <w:tcW w:type="dxa" w:w="2946"/>
+          </w:tcPr>
+          <w:p>
+            <w:r>
+              <w:rPr>
+                <w:sz w:val="18"/>
+              </w:rPr>
+              <w:t>Weekend &amp; local outings</w:t>
+            </w:r>
+          </w:p>
+        </w:tc>
+        <w:tc>
+          <w:tcPr>
+            <w:tcW w:type="dxa" w:w="2946"/>
+          </w:tcPr>
+          <w:p>
+            <w:r>
+              <w:rPr>
+                <w:sz w:val="18"/>
+              </w:rPr>
+              <w:t>Weekly</w:t>
+            </w:r>
+          </w:p>
+        </w:tc>
+        <w:tc>
+          <w:tcPr>
+            <w:tcW w:type="dxa" w:w="2946"/>
+          </w:tcPr>
+          <w:p>
+            <w:r>
+              <w:rPr>
+                <w:sz w:val="18"/>
+              </w:rPr>
+              <w:t>Engagement and content ("it's my weekend with the kids")</w:t>
+            </w:r>
+          </w:p>
+        </w:tc>
+      </w:tr>
+      <w:tr>
+        <w:tc>
+          <w:tcPr>
+            <w:tcW w:type="dxa" w:w="2946"/>
+          </w:tcPr>
+          <w:p>
+            <w:r>
+              <w:rPr>
+                <w:sz w:val="18"/>
+              </w:rPr>
+              <w:t>Trips &amp; vacations</w:t>
+            </w:r>
+          </w:p>
+        </w:tc>
+        <w:tc>
+          <w:tcPr>
+            <w:tcW w:type="dxa" w:w="2946"/>
+          </w:tcPr>
+          <w:p>
+            <w:r>
+              <w:rPr>
+                <w:sz w:val="18"/>
+              </w:rPr>
+              <w:t>1–3 episodes/yr</w:t>
+            </w:r>
+          </w:p>
+        </w:tc>
+        <w:tc>
+          <w:tcPr>
+            <w:tcW w:type="dxa" w:w="2946"/>
+          </w:tcPr>
+          <w:p>
+            <w:r>
+              <w:rPr>
+                <w:sz w:val="18"/>
+              </w:rPr>
+              <w:t>Custody-schedule-scoped only; never "AI trip planner"</w:t>
+            </w:r>
+          </w:p>
+        </w:tc>
+      </w:tr>
+    </w:tbl>
+    <w:p/>
+    <w:p>
+      <w:r>
+        <w:t>Discipline rule: one agent with five entry doors, not five features on a homepage. The landing page always leads with whichever seasonal episode is next on the calendar (as of July: fall activity registration and the back-to-school email wave); the "your family's activity year" map is the reveal, never the pitch. This also strengthens pricing: the subscription is roughly 3% of the $3,000–5,000+ a two-kid activity family already spends on the things it coordinates.</w:t>
+      </w:r>
+    </w:p>
+    <w:p>
+      <w:pPr>
+        <w:pStyle w:val="Heading2"/>
+      </w:pPr>
+      <w:r>
+        <w:t>Three design commitments from the adversarial review</w:t>
+      </w:r>
+    </w:p>
+    <w:p>
+      <w:r>
+        <w:t>In July 2026 we ran the strategy through a five-persona adversarial council (skeptic, optimist, first-principles analyst, market researcher, and a role-played buyer), then fact-checked its load-bearing claims at primary sources. It confirmed the wedge and forced three product commitments:</w:t>
+      </w:r>
+    </w:p>
+    <w:p>
+      <w:r>
+        <w:rPr>
+          <w:b/>
+        </w:rPr>
+        <w:t xml:space="preserve">1. Solo-first, zero-friction second parent. </w:t>
+      </w:r>
+      <w:r>
+        <w:t>The single biggest failure mode in this category is "my ex won't use the app"—so common the incumbents publish help articles about it, and their only remedy is a court order. Our answer is design, not litigation: parent #1 gets full value alone; parent #2 participates by accepting ordinary calendar invites and forwarding emails to a magic address—no install, no account, no cost. No co-parenting product on the market does frictionless inclusion (their "solo modes" mean documenting unilaterally for court). The positioning line: "the logistics work even when only one of you does."</w:t>
+      </w:r>
+    </w:p>
+    <w:p>
+      <w:r>
+        <w:rPr>
+          <w:b/>
+        </w:rPr>
+        <w:t xml:space="preserve">2. The registration-window watchlist (the "spot-getter"). </w:t>
+      </w:r>
+      <w:r>
+        <w:t>The sharpest camp pain is not choosing—it's getting a SPOT: popular registrations sell out in minutes, parents set alarms and trade dates in group chats, and no national parent-side product watches registration-open windows (the only entrant is a manual, single-metro database). "We watch the registration dates near you, alert you before they open, and have your details ready" turns our discovery agent from list-maker into spot-getter—and re-arms the product every season, which is the honest retention engine.</w:t>
+      </w:r>
+    </w:p>
+    <w:p>
+      <w:r>
+        <w:rPr>
+          <w:b/>
+        </w:rPr>
+        <w:t xml:space="preserve">3. Split data model: durable logistics, zero-retention coach. </w:t>
+      </w:r>
+      <w:r>
+        <w:t>Co-parenting incumbents SELL discoverability (court-certified records; published subpoena fee schedules), and family-law attorneys now warn divorcing clients that AI chat logs are discoverable and carry no privilege. So we split the product's data in two and say so loudly: logistics data (calendar, activities, handoffs) is durable, exportable, yours; the AI coach runs zero-retention—no server-side transcripts, nothing to produce. Honest copy only: this reduces exposure, it does not create legal privilege. No family app occupies this position today.</w:t>
+      </w:r>
+    </w:p>
+    <w:p>
+      <w:pPr>
+        <w:pStyle w:val="Heading2"/>
+      </w:pPr>
+      <w:r>
+        <w:t>Who we acquire first (beachhead personas)</w:t>
+      </w:r>
+    </w:p>
+    <w:p>
+      <w:r>
+        <w:rPr>
+          <w:b/>
+        </w:rPr>
+        <w:t xml:space="preserve">The two-home logistics dad. </w:t>
+      </w:r>
+      <w:r>
+        <w:t>35–48, divorced or separated, shared custody, kids 3–12. Already pays for OurFamilyWizard (often court-ordered). Trigger: camp season, a missed activity that caused conflict. Miguel's mirror—and the founder story is the content engine.</w:t>
+      </w:r>
+    </w:p>
+    <w:p>
+      <w:r>
+        <w:rPr>
+          <w:b/>
+        </w:rPr>
+        <w:t xml:space="preserve">The maxed-out coordinating mom. </w:t>
+      </w:r>
+      <w:r>
+        <w:t>32–45, dual-income, primary logistics owner, carries the mental load (mothers carry ~67% more household to-do items — Univ. of Bath, 2025). Trigger: the spring camp-planning panic and the 40-tab spreadsheet. Heather is this persona—she lives it daily with her 9- and 5-year-old girls—so this segment, like the first, gets a founder's authentic voice.</w:t>
+      </w:r>
+    </w:p>
+    <w:p>
+      <w:r>
+        <w:rPr>
+          <w:b/>
+        </w:rPr>
+        <w:t xml:space="preserve">The newly separated parent. </w:t>
+      </w:r>
+      <w:r>
+        <w:t>In the acute chaos phase; highest willingness to adopt a new system; reachable through attorneys, mediators, and therapists—a referral channel we will pilot.</w:t>
+      </w:r>
+    </w:p>
+    <w:p>
+      <w:pPr>
+        <w:pStyle w:val="Heading2"/>
+      </w:pPr>
+      <w:r>
+        <w:t>Pricing hypothesis (to be tested, not assumed)</w:t>
+      </w:r>
+    </w:p>
+    <w:p>
+      <w:r>
+        <w:t>Test range: $99–$149 per family per year, with $199 kept as the top willingness-to-pay bucket to measure headroom. One subscription covers the family; the second parent is genuinely free forever. The adversarial review corrected our original $199 anchor: court-ordered parents can't cancel OurFamilyWizard, so we are additive to that spend, not a replacement—our real price competition is the AI family-assistant market, which clusters at $39–99/yr (Ohai $99, Nori ~$96, Skylight Plus $79). Anchor the copy against the activity budget ("~3% of what you already spend on the things it coordinates") and the prevented scramble week, never against OFW. Hard paywall with a trial rather than freemium (RevenueCat 2026: ~5x conversion, near-identical retention), plus a seasonal risk-reversal in year one ("full refund before September 1—if it doesn't survive one real summer, you pay nothing"). The funnel's willingness-to-pay question sets the final number, segmented by household structure.</w:t>
+      </w:r>
+    </w:p>
+    <w:p>
+      <w:pPr>
+        <w:pStyle w:val="Heading2"/>
+      </w:pPr>
+      <w:r>
+        <w:t>The validation funnel (the next 90 days)</w:t>
+      </w:r>
+    </w:p>
+    <w:p>
+      <w:r>
+        <w:t>Both playbooks we studied agree: validate demand before building more. Two engines run in parallel, both feeding one email list.</w:t>
+      </w:r>
+    </w:p>
+    <w:p>
+      <w:r>
+        <w:rPr>
+          <w:b/>
+        </w:rPr>
+        <w:t xml:space="preserve">The Family Snapshot quiz. </w:t>
+      </w:r>
+      <w:r>
+        <w:t>Our 8-step onboarding, ported to a public landing page as a quiz. Email capture at question 3–4; a friction question whose answer options map to the five verticals (so respondents vote on our headline for us); a household-structure question ("does your kids' other parent live with you?")—the single most valuable segmentation of the willingness-to-pay data; the willingness-to-pay question; and a genuinely useful AI-generated payoff: each kid's stage, named friction points, three things to try this week, and a 12-month map of the family's activity year. Free to generate; the full version requires an account. This is simultaneously the lead magnet, the pricing test, and a live product demo.</w:t>
+      </w:r>
+    </w:p>
+    <w:p>
+      <w:r>
+        <w:rPr>
+          <w:b/>
+        </w:rPr>
+        <w:t xml:space="preserve">Paid truth serum. </w:t>
+      </w:r>
+      <w:r>
+        <w:t>~$20/day of Meta ads for two weeks, pixel firing only on email capture, 5–8 hooks tested. The flagship creative: snap a photo of the field-trip flyer, and the permission-slip task, the fee to-do, and the date land on both parents' calendars in five seconds—visual, verifiable, unfakeable. Two hooks from the adversarial review join the set: "it watches registration-open dates so you don't have to set alarms" and "works even if your ex never installs it—they just get calendar invites."</w:t>
+      </w:r>
+    </w:p>
+    <w:p>
+      <w:r>
+        <w:rPr>
+          <w:b/>
+        </w:rPr>
+        <w:t xml:space="preserve">Founder-led content — two voices. </w:t>
+      </w:r>
+      <w:r>
+        <w:t>Daily educational posts for 30 days, split across two authentic founder voices: Miguel on the divorce-dad / two-household angle, Heather on the mental-load / coordinating-mom angle. Between them the founders embody both beachhead personas first-hand, and their kids' ages overlap (roughly 4–5 and 9–10), so every stage-specific topic—bedtime for the little one, activities and friendships for the big kid—is lived experience, told from two household structures. Same playbook as Dr. Becky / Big Little Feelings: give away genuinely useful material and the audience compounds into demand. No selling—one line pointing to the Snapshot. Two voices also halves the per-person cadence needed to stay daily.</w:t>
+      </w:r>
+    </w:p>
+    <w:p>
+      <w:r>
+        <w:rPr>
+          <w:b/>
+        </w:rPr>
+        <w:t xml:space="preserve">Early-access cohort. </w:t>
+      </w:r>
+      <w:r>
+        <w:t>The warmest leads become founding families: a lifetime discount (~$99/yr locked for life vs. $199 standard) in exchange for daily feedback—early product champions, not revenue.</w:t>
+      </w:r>
+    </w:p>
+    <w:p>
+      <w:pPr>
+        <w:pStyle w:val="Heading3"/>
+      </w:pPr>
+      <w:r>
+        <w:t>Decision gates (numbers, not vibes)</w:t>
+      </w:r>
+    </w:p>
+    <w:p>
+      <w:pPr>
+        <w:pStyle w:val="ListBullet"/>
+      </w:pPr>
+      <w:r>
+        <w:t>Gate zero, before any ad spend (48 hours, under $50): message 25 separated parents with the solo-first pitch. Pass = at least 5 would pay ~$10/mo AND at least 15 believe zero-friction ex participation (invites + email forwarding) would actually happen in their situation. Fail the second condition → lead with the maxed-out-mom persona instead of the co-parent angle.</w:t>
+      </w:r>
+    </w:p>
+    <w:p>
+      <w:pPr>
+        <w:pStyle w:val="ListBullet"/>
+      </w:pPr>
+      <w:r>
+        <w:t>200 emails by day 30, or the offer/messaging is wrong (pivot the hook before abandoning the wedge).</w:t>
+      </w:r>
+    </w:p>
+    <w:p>
+      <w:pPr>
+        <w:pStyle w:val="ListBullet"/>
+      </w:pPr>
+      <w:r>
+        <w:t>Median willingness-to-pay ≥ $100/yr green-lights the paid cohort; $50–99 means reprice and re-message; below $50 means rethink the wedge.</w:t>
+      </w:r>
+    </w:p>
+    <w:p>
+      <w:pPr>
+        <w:pStyle w:val="ListBullet"/>
+      </w:pPr>
+      <w:r>
+        <w:t>Cost per email ≤ $3–5 after creative iteration, or paid is shelved in favor of organic + referrals.</w:t>
+      </w:r>
+    </w:p>
+    <w:p>
+      <w:pPr>
+        <w:pStyle w:val="ListBullet"/>
+      </w:pPr>
+      <w:r>
+        <w:t>If one non-camp vertical wins the quiz friction vote by more than 2x, the headline changes—the product doesn't have to.</w:t>
+      </w:r>
+    </w:p>
+    <w:p>
+      <w:pPr>
+        <w:pStyle w:val="ListBullet"/>
+      </w:pPr>
+      <w:r>
+        <w:t>Sports-registration claims stay out of ads until the discovery agent's hit-rate is validated in 2–3 metro areas.</w:t>
+      </w:r>
+    </w:p>
+    <w:p>
+      <w:pPr>
+        <w:pStyle w:val="Heading2"/>
+      </w:pPr>
+      <w:r>
+        <w:t>Regulatory posture and trust</w:t>
+      </w:r>
+    </w:p>
+    <w:p>
+      <w:r>
+        <w:t>We market a PARENT-FACING tool, full stop. The kids' voice companion stays out of all GTM until compliance and legal review are complete: the amended COPPA rule is now in force (compliance date April 22, 2026—voiceprints are now "personal information," AI training requires separate verifiable parental consent, indefinite retention is banned), and the FTC opened a formal inquiry into companion chatbots and children in September 2025. Regardless of marketing, we build the compliance kit: age gates, consent flows, a written retention policy, and data deletion. Trust is also a moat we can buy cheaply: one named clinical/child-development advisor, a public evidence-and-methodology page, and a plain-language safety and data page—which now also states the split data model from design commitment #3 (durable, exportable logistics data; zero-retention coach). Social proof is never fabricated—until real testimonials exist (with consent), we borrow authority from cited research and the founder story.</w:t>
+      </w:r>
+    </w:p>
+    <w:p>
+      <w:pPr>
+        <w:pStyle w:val="Heading2"/>
+      </w:pPr>
+      <w:r>
+        <w:t>Honest ceiling and what raises it</w:t>
+      </w:r>
+    </w:p>
+    <w:p>
+      <w:r>
+        <w:t>Modeled scenarios put the base case around $250–300K ARR at 24 months (roughly 1,800–2,200 paying families at $129)—a strong independent business, not yet a venture story. Three things upgrade it: funnel proof that acquisition cost is far below lifetime value; a camp-booking marketplace take-rate on top of the discovery agent; and B2B2C channels (family-law mediators and therapists, employers/EAPs, pediatricians) that de-risk churn the way court mandates de-risk OurFamilyWizard's. We do not raise money before the funnel produces those numbers—our AI-augmented build speed means we can reach revenue cheaply.</w:t>
+      </w:r>
+    </w:p>
+    <w:p>
+      <w:pPr>
+        <w:pStyle w:val="Heading3"/>
+      </w:pPr>
+      <w:r>
+        <w:t>The 90-day sequence</w:t>
+      </w:r>
+    </w:p>
+    <w:p>
+      <w:r>
+        <w:rPr>
+          <w:b/>
+        </w:rPr>
+        <w:t xml:space="preserve">Weeks 1–2 — falsify cheap, instrument the truth. </w:t>
+      </w:r>
+      <w:r>
+        <w:t>Run gate zero (the 25-parent solo-first test); harvest verbatim parent language from Reddit/Facebook into a swipe file; ship the Family Snapshot funnel with the fall-registration lead; publish the evidence + safety/data pages; approach one advisor.</w:t>
+      </w:r>
+    </w:p>
+    <w:p>
+      <w:r>
+        <w:rPr>
+          <w:b/>
+        </w:rPr>
+        <w:t xml:space="preserve">Weeks 3–6 — run both engines. </w:t>
+      </w:r>
+      <w:r>
+        <w:t>Meta ads at $20/day; daily founder content in two voices (Miguel and Heather, alternating); drive toward the 200-email bar and the WTP read; recruit the founding-family cohort from the warmest leads. In parallel, small funnel-informed product work: the zero-friction parent-#2 flow and a first registration-window watchlist for one or two pilot metros.</w:t>
+      </w:r>
+    </w:p>
+    <w:p>
+      <w:r>
+        <w:rPr>
+          <w:b/>
+        </w:rPr>
+        <w:t xml:space="preserve">Weeks 7–12 — convert and decide. </w:t>
+      </w:r>
+      <w:r>
+        <w:t>Founding-family lifetime deal with daily feedback; hard-paywall trial plus the September-1 risk reversal; first real testimonials; pilot outreach to 3–5 family-law mediators/therapists. Then the gates decide what we do next.</w:t>
+      </w:r>
+    </w:p>
+    <w:p>
+      <w:pPr>
+        <w:spacing w:before="240" w:after="240"/>
+        <w:pBdr>
+          <w:bottom w:val="single" w:sz="4" w:space="1" w:color="6F6A60"/>
+        </w:pBdr>
+      </w:pPr>
+    </w:p>
     <w:p/>
     <w:p>
       <w:pPr>
@@ -2563,7 +3311,7 @@
           <w:color w:val="6F6A60"/>
           <w:sz w:val="20"/>
         </w:rPr>
-        <w:t>MVP — June 2026</w:t>
+        <w:t>MVP — June 2026, rev. July 2026</w:t>
       </w:r>
     </w:p>
     <w:sectPr>

</xml_diff>

<commit_message>
Ground Zero doc: July 12 revision — vertical expansion is shipped reality
- §5 (What We Have Built): the chief-of-staff section now leads with the
  five live verticals and the shipped registration-window watchlist; adds
  school-mail multi-item ingestion with provenance, public illustrated
  docs site, the eval gates + alerting under production hardening; new
  end-to-end paragraph walking one sentence per vertical.
- §8: must-ship list converted to a status list — identity and crisis
  push SHIPPED, the 1.66 TestFlight upload is the one pending ship.
- §12: watchlist commitment marked SHIPPED with the trust mechanics;
  Activity OS table gets a "this is no longer a roadmap" status note;
  weeks 3–6 updated (watchlist shipped ahead of schedule); trust kit
  notes the live docs site as its first brick.
- Regenerated MVP-Ground-Zero.docx (Drive upload pending gws re-auth).

Co-Authored-By: Claude Fable 5 <noreply@anthropic.com>
</commit_message>
<xml_diff>
--- a/docs/GTM/MVP-Ground-Zero.docx
+++ b/docs/GTM/MVP-Ground-Zero.docx
@@ -58,7 +58,7 @@
           <w:color w:val="6F6A60"/>
           <w:sz w:val="22"/>
         </w:rPr>
-        <w:t>June 2026 · revised July 2026</w:t>
+        <w:t>June 2026 · revised July 12, 2026</w:t>
         <w:br/>
         <w:t>Miguel Alvarado, Heather Hannan-Kramer, Greg Harris</w:t>
       </w:r>
@@ -787,7 +787,7 @@
         <w:t xml:space="preserve">The Plan tab. </w:t>
       </w:r>
       <w:r>
-        <w:t>A fifth tab, chat-first: the home of the family chief of staff (detailed below)—Chat, Discover, Shortlist, and Calendar in one place, plus "add from a message or photo" ingestion.</w:t>
+        <w:t>A fifth tab, chat-first: the home of the family chief of staff (detailed below)—Chat, Discover, Shortlist, and Calendar in one place, plus "add from a message or photo" ingestion and a "Plan something" menu of entry doors (camps, classes &amp; sports, weekend outings, family trips).</w:t>
       </w:r>
     </w:p>
     <w:p>
@@ -904,6 +904,28 @@
         <w:rPr>
           <w:b/>
         </w:rPr>
+        <w:t xml:space="preserve">All five verticals, live (July 11). </w:t>
+      </w:r>
+      <w:r>
+        <w:t>The "one agent, five entry doors" architecture from Section 12 is no longer a plan—it is deployed. One chief of staff handles camps &amp; school breaks, weekly classes &amp; sports (with real recurring schedules: "Tuesdays 4:00 PM through Dec 15"), school life (picture day, permission slips, fees), weekend outings, and family trips (dates, both calendars, packing lists—never bookings). Each is a door into the same agent and a filter chip on the same board, exactly as the strategy demands.</w:t>
+      </w:r>
+    </w:p>
+    <w:p>
+      <w:r>
+        <w:rPr>
+          <w:b/>
+        </w:rPr>
+        <w:t xml:space="preserve">The registration-window watchlist, live. </w:t>
+      </w:r>
+      <w:r>
+        <w:t>Design commitment #2 from the adversarial review is shipped: tell the assistant when a registration opens ("rec soccer signup opens August 12") and the app watches it—a push notification seven days ahead and again before it opens, never after. Dates the agent researched itself are labeled as estimates and the parent confirms them with one tap; dates you give us are a promise we keep at 100%. Every watched window is visible on its card ("Registration opens Aug 12 · watching"), and a miss-detector alarm watches the watcher.</w:t>
+      </w:r>
+    </w:p>
+    <w:p>
+      <w:r>
+        <w:rPr>
+          <w:b/>
+        </w:rPr>
         <w:t xml:space="preserve">Activity discovery agent. </w:t>
       </w:r>
       <w:r>
@@ -918,7 +940,7 @@
         <w:t xml:space="preserve">Chief-of-staff chat. </w:t>
       </w:r>
       <w:r>
-        <w:t>A conversational agent with 19 working tools: it compares shortlisted options ("help me decide"—cost, age eligibility, schedule conflicts, coverage gaps across kids and weeks), tracks decisions with rationale, manages to-dos, drafts emails to camp directors (never sends), looks up and saves camps you already registered for, and can kick off new discovery runs mid-conversation.</w:t>
+        <w:t>A conversational agent with 20 working tools: it compares shortlisted options ("help me decide"—cost, age eligibility, schedule conflicts, coverage gaps across kids and weeks), tracks decisions with rationale, manages to-dos, watches registration windows, drafts emails to camp directors (never sends), looks up and saves activities you already registered for, and can kick off new discovery runs mid-conversation.</w:t>
       </w:r>
     </w:p>
     <w:p>
@@ -926,10 +948,10 @@
         <w:rPr>
           <w:b/>
         </w:rPr>
-        <w:t xml:space="preserve">Flyer and message ingestion. </w:t>
-      </w:r>
-      <w:r>
-        <w:t>Paste a text message or snap a photo of a paper flyer; the vision pipeline extracts the activity, tracks it, adds calendar entries, and spawns the follow-up to-dos (confirm eligibility, pay the fee).</w:t>
+        <w:t xml:space="preserve">School-mail and flyer ingestion. </w:t>
+      </w:r>
+      <w:r>
+        <w:t>Paste a newsletter or snap a photo of a paper flyer; the vision pipeline extracts EVERY item in it (a single PTA newsletter can carry picture day, a fundraiser, and a permission slip), spawns the right kind of to-do for each (form to sign, fee to pay), and shows every extracted deadline next to the exact sentence it came from—so a parent can verify at a glance instead of trusting a black box.</w:t>
       </w:r>
     </w:p>
     <w:p>
@@ -951,7 +973,7 @@
         <w:t xml:space="preserve">Two-way Google Calendar sync. </w:t>
       </w:r>
       <w:r>
-        <w:t>The family plan lives where parents already look. Pulls external events in; pushes plan entries out.</w:t>
+        <w:t>The family plan lives where parents already look. Pulls external events in; pushes plan entries out—including a trip's all-day entries for each kid, so a co-parent sees the dates without anyone sending a text.</w:t>
       </w:r>
     </w:p>
     <w:p>
@@ -970,6 +992,17 @@
         <w:rPr>
           <w:b/>
         </w:rPr>
+        <w:t xml:space="preserve">Public product docs. </w:t>
+      </w:r>
+      <w:r>
+        <w:t>A "How MVP works" site (no login required) ships with the dashboard: thirteen illustrated pages—real product screenshots, not mockups—covering every vertical plus the parenting coach and the kids' companions (consent, moderation, crisis lock, parent-visible transcripts, in plain language). This is the first brick of the trust kit Section 12 calls for, and the page the validation funnel can link to.</w:t>
+      </w:r>
+    </w:p>
+    <w:p>
+      <w:r>
+        <w:rPr>
+          <w:b/>
+        </w:rPr>
         <w:t xml:space="preserve">Profile editing everywhere. </w:t>
       </w:r>
       <w:r>
@@ -984,7 +1017,7 @@
         <w:t xml:space="preserve">Production hardening. </w:t>
       </w:r>
       <w:r>
-        <w:t>Error tracking (Sentry), metrics dashboards (Grafana), cost logging per AI call, concurrency fixes proven under fault injection, and guardrail tests for the bug classes our beta families actually hit.</w:t>
+        <w:t>Error tracking (Sentry), metrics dashboards with live alerting to Slack (Grafana—including a dedicated watchlist reliability panel), cost logging per AI call, concurrency fixes proven under fault injection, guardrail tests for the bug classes our beta families actually hit, and a live-model evaluation gate: every change to the agent's instructions must pass a 27-scenario tool-selection exam and a 12-flyer extraction exam before it ships.</w:t>
       </w:r>
     </w:p>
     <w:p>
@@ -1003,6 +1036,11 @@
     <w:p>
       <w:r>
         <w:t>And on the logistics side: a parent can ask for summer camps near them, watch real options stream in scored to each kid's age, save a shortlist, ask the chief of staff to compare them, snap a photo of a flyer from the school backpack, and see all of it land on a calendar that syncs with Google—live in production today.</w:t>
+      </w:r>
+    </w:p>
+    <w:p>
+      <w:r>
+        <w:t>As of July 11, the same is true across the whole activity year: "Mar is doing soccer this fall, every Tuesday at 4"—tracked with its real weekly schedule. "Rec soccer signup opens August 12"—watched, with reminders before it opens. "Picture day is October 9"—on the radar with the form and fee to-dos. "We're at grandma's August 14 to 18"—on both calendars, packing list started, and those days never show up as a childcare gap. One agent, five doors, one board.</w:t>
       </w:r>
     </w:p>
     <w:p>
@@ -1487,7 +1525,7 @@
         <w:pStyle w:val="Heading2"/>
       </w:pPr>
       <w:r>
-        <w:t>Must-ship for beta</w:t>
+        <w:t>Must-ship for beta — status</w:t>
       </w:r>
     </w:p>
     <w:p>
@@ -1495,10 +1533,10 @@
         <w:rPr>
           <w:b/>
         </w:rPr>
-        <w:t xml:space="preserve">Real user identity. </w:t>
-      </w:r>
-      <w:r>
-        <w:t>Replace the current name-based login with Apple Sign-In or a real account system. Two parents named "Miguel" must not collide. This is the single biggest blocker for putting real families on the app.</w:t>
+        <w:t xml:space="preserve">Real user identity — SHIPPED. </w:t>
+      </w:r>
+      <w:r>
+        <w:t>Native Apple and Google Sign-In with real accounts (rotating secure tokens) replaced the name-based login. Existing families were migrated without losing data. The "two Miguels collide" blocker is closed.</w:t>
       </w:r>
     </w:p>
     <w:p>
@@ -1506,10 +1544,10 @@
         <w:rPr>
           <w:b/>
         </w:rPr>
-        <w:t xml:space="preserve">TestFlight release of the new experience. </w:t>
-      </w:r>
-      <w:r>
-        <w:t>The chat-first Plan hub, the profile editor, calendar sync, and the Connect-Gmail flow are built and verified—they ship to beta families with the next TestFlight build.</w:t>
+        <w:t xml:space="preserve">Crisis parent notification — SHIPPED. </w:t>
+      </w:r>
+      <w:r>
+        <w:t>A crisis in a kid companion now fires a real push notification to the parent's phone (verified on a physical device), locks the conversation, and stays locked until the parent reviews and reactivates.</w:t>
       </w:r>
     </w:p>
     <w:p>
@@ -1517,10 +1555,10 @@
         <w:rPr>
           <w:b/>
         </w:rPr>
-        <w:t xml:space="preserve">Crisis parent notification. </w:t>
-      </w:r>
-      <w:r>
-        <w:t>When a kid companion detects a crisis, the parent currently gets a Slack alert (internal). Before beta, this must be a real push notification to the parent's device.</w:t>
+        <w:t xml:space="preserve">TestFlight release of the new experience — the one pending ship. </w:t>
+      </w:r>
+      <w:r>
+        <w:t>The five-doors experience (all verticals, the watchlist, the illustrated docs) is live on the production backend and web dashboard; the iOS build that surfaces it (1.66) is built and verified and ships with the next TestFlight upload. Beta phones run the previous build until then—nothing breaks meanwhile.</w:t>
       </w:r>
     </w:p>
     <w:p>
@@ -1528,7 +1566,7 @@
         <w:rPr>
           <w:b/>
         </w:rPr>
-        <w:t xml:space="preserve">Onboarding polish. </w:t>
+        <w:t xml:space="preserve">Onboarding polish — open. </w:t>
       </w:r>
       <w:r>
         <w:t>Low-friction, drip-style information collection. Don't ask for everything upfront. Let the app learn the family over time. Greg's WeTransfer insight: one simple action to start.</w:t>
@@ -1539,7 +1577,7 @@
         <w:rPr>
           <w:b/>
         </w:rPr>
-        <w:t xml:space="preserve">Design review &amp; dead ends. </w:t>
+        <w:t xml:space="preserve">Design review &amp; dead ends — open. </w:t>
       </w:r>
       <w:r>
         <w:t>Greg will map the current user journeys in Figma, identify "dead ends" where the user gets stuck, and propose solutions.</w:t>
@@ -3000,6 +3038,17 @@
       </w:r>
     </w:p>
     <w:p>
+      <w:r>
+        <w:rPr>
+          <w:b/>
+        </w:rPr>
+        <w:t xml:space="preserve">Status, July 11: this table is no longer a roadmap. </w:t>
+      </w:r>
+      <w:r>
+        <w:t>All five verticals are live in production behind one agent, built in a single week-long push and hardened by an adversarial three-critic design review, live-model evaluation gates, and end-to-end tests against real AI on every vertical. The engine was activity-type-agnostic as promised: the fifth vertical (trips) required zero new instrumentation and zero client changes. When fall registration season arrives, the product the ads describe already exists.</w:t>
+      </w:r>
+    </w:p>
+    <w:p>
       <w:pPr>
         <w:pStyle w:val="Heading2"/>
       </w:pPr>
@@ -3028,10 +3077,10 @@
         <w:rPr>
           <w:b/>
         </w:rPr>
-        <w:t xml:space="preserve">2. The registration-window watchlist (the "spot-getter"). </w:t>
-      </w:r>
-      <w:r>
-        <w:t>The sharpest camp pain is not choosing—it's getting a SPOT: popular registrations sell out in minutes, parents set alarms and trade dates in group chats, and no national parent-side product watches registration-open windows (the only entrant is a manual, single-metro database). "We watch the registration dates near you, alert you before they open, and have your details ready" turns our discovery agent from list-maker into spot-getter—and re-arms the product every season, which is the honest retention engine.</w:t>
+        <w:t xml:space="preserve">2. The registration-window watchlist (the "spot-getter") — SHIPPED July 11. </w:t>
+      </w:r>
+      <w:r>
+        <w:t>The sharpest camp pain is not choosing—it's getting a SPOT: popular registrations sell out in minutes, parents set alarms and trade dates in group chats, and no national parent-side product watches registration-open windows (the only entrant is a manual, single-metro database). "We watch the registration dates near you, alert you before they open, and have your details ready" turns our discovery agent from list-maker into spot-getter—and re-arms the product every season, which is the honest retention engine. This is now LIVE: reminders 7 days ahead and before the window opens (never after), researched dates labeled as estimates until the parent confirms, and an internal alarm that fires if we ever miss one—because the promise is only worth making if we can keep it at 100%.</w:t>
       </w:r>
     </w:p>
     <w:p>
@@ -3222,7 +3271,7 @@
     </w:p>
     <w:p>
       <w:r>
-        <w:t>We market a PARENT-FACING tool, full stop. The kids' voice companion stays out of all GTM until compliance and legal review are complete: the amended COPPA rule is now in force (compliance date April 22, 2026—voiceprints are now "personal information," AI training requires separate verifiable parental consent, indefinite retention is banned), and the FTC opened a formal inquiry into companion chatbots and children in September 2025. Regardless of marketing, we build the compliance kit: age gates, consent flows, a written retention policy, and data deletion. Trust is also a moat we can buy cheaply: one named clinical/child-development advisor, a public evidence-and-methodology page, and a plain-language safety and data page—which now also states the split data model from design commitment #3 (durable, exportable logistics data; zero-retention coach). Social proof is never fabricated—until real testimonials exist (with consent), we borrow authority from cited research and the founder story.</w:t>
+        <w:t>We market a PARENT-FACING tool, full stop. The kids' voice companion stays out of all GTM until compliance and legal review are complete: the amended COPPA rule is now in force (compliance date April 22, 2026—voiceprints are now "personal information," AI training requires separate verifiable parental consent, indefinite retention is banned), and the FTC opened a formal inquiry into companion chatbots and children in September 2025. Regardless of marketing, we build the compliance kit: age gates, consent flows, a written retention policy, and data deletion. Trust is also a moat we can buy cheaply: one named clinical/child-development advisor, a public evidence-and-methodology page, and a plain-language safety and data page—which now also states the split data model from design commitment #3 (durable, exportable logistics data; zero-retention coach). The first brick is laid: a public, no-login "How MVP works" docs site now ships with the product—thirteen illustrated pages including plain-language pages on the coach and the kids' companions (consent, moderation, crisis lock, parent-visible transcripts). Social proof is never fabricated—until real testimonials exist (with consent), we borrow authority from cited research and the founder story.</w:t>
       </w:r>
     </w:p>
     <w:p>
@@ -3265,7 +3314,7 @@
         <w:t xml:space="preserve">Weeks 3–6 — run both engines. </w:t>
       </w:r>
       <w:r>
-        <w:t>Meta ads at $20/day; daily founder content in two voices (Miguel and Heather, alternating); drive toward the 200-email bar and the WTP read; recruit the founding-family cohort from the warmest leads. In parallel, small funnel-informed product work: the zero-friction parent-#2 flow and a first registration-window watchlist for one or two pilot metros.</w:t>
+        <w:t>Meta ads at $20/day; daily founder content in two voices (Miguel and Heather, alternating); drive toward the 200-email bar and the WTP read; recruit the founding-family cohort from the warmest leads. In parallel, small funnel-informed product work: the zero-friction parent-#2 flow. (The registration-window watchlist, originally slotted here, shipped ahead of schedule on July 11 and is live in production.)</w:t>
       </w:r>
     </w:p>
     <w:p>
@@ -3311,7 +3360,7 @@
           <w:color w:val="6F6A60"/>
           <w:sz w:val="20"/>
         </w:rPr>
-        <w:t>MVP — June 2026, rev. July 2026</w:t>
+        <w:t>MVP — June 2026, rev. July 12, 2026</w:t>
       </w:r>
     </w:p>
     <w:sectPr>

</xml_diff>

<commit_message>
Ground Zero: §8 rewritten as the beta-readiness checklist; pricing fix
Section 8's must-ship list now reconciles Heather's 16 "cleanup before
beta" items against what the codebase actually has — three buckets
(already shipped / to build / deferred-with-a-demand-test), with the two
deferrals (payments, in-app chat invites) flagged as meeting decisions.
Also fixes the Section 12 pricing self-contradiction (the founding-family
bullet re-anchored to the $199 the same section had corrected — now
$79-99 locked vs $129-149 per gtm-strategy.md), aligns the cost-control
figure to $4-11k, bumps the footer to rev. July 17.

Co-Authored-By: Claude Fable 5 <noreply@anthropic.com>
</commit_message>
<xml_diff>
--- a/docs/GTM/MVP-Ground-Zero.docx
+++ b/docs/GTM/MVP-Ground-Zero.docx
@@ -1530,10 +1530,23 @@
     </w:p>
     <w:p>
       <w:r>
+        <w:t>This is the consolidated beta-readiness checklist. It reconciles Heather's "cleanup before beta" list against what the codebase actually has today, sorted into three buckets: already shipped, to build before beta, and deliberately deferred with a demand test. The two deferrals (payments and in-app chat invites) are calls to confirm together in this meeting, not decisions already made.</w:t>
+      </w:r>
+    </w:p>
+    <w:p>
+      <w:pPr>
+        <w:pStyle w:val="Heading3"/>
+      </w:pPr>
+      <w:r>
+        <w:t>Already shipped</w:t>
+      </w:r>
+    </w:p>
+    <w:p>
+      <w:r>
         <w:rPr>
           <w:b/>
         </w:rPr>
-        <w:t xml:space="preserve">Real user identity — SHIPPED. </w:t>
+        <w:t xml:space="preserve">Real user identity + sign-in. </w:t>
       </w:r>
       <w:r>
         <w:t>Native Apple and Google Sign-In with real accounts (rotating secure tokens) replaced the name-based login. Existing families were migrated without losing data. The "two Miguels collide" blocker is closed.</w:t>
@@ -1544,10 +1557,10 @@
         <w:rPr>
           <w:b/>
         </w:rPr>
-        <w:t xml:space="preserve">Crisis parent notification — SHIPPED. </w:t>
-      </w:r>
-      <w:r>
-        <w:t>A crisis in a kid companion now fires a real push notification to the parent's phone (verified on a physical device), locks the conversation, and stays locked until the parent reviews and reactivates.</w:t>
+        <w:t xml:space="preserve">Crisis parent notification. </w:t>
+      </w:r>
+      <w:r>
+        <w:t>A crisis in a kid companion fires a real push notification to the parent's phone (verified on a physical device), locks the conversation, and stays locked until the parent reviews and reactivates.</w:t>
       </w:r>
     </w:p>
     <w:p>
@@ -1555,10 +1568,10 @@
         <w:rPr>
           <w:b/>
         </w:rPr>
-        <w:t xml:space="preserve">TestFlight release of the new experience — the one pending ship. </w:t>
-      </w:r>
-      <w:r>
-        <w:t>The five-doors experience (all verticals, the watchlist, the illustrated docs) is live on the production backend and web dashboard; the iOS build that surfaces it (1.66) is built and verified and ships with the next TestFlight upload. Beta phones run the previous build until then—nothing breaks meanwhile.</w:t>
+        <w:t xml:space="preserve">Profile view + edit. </w:t>
+      </w:r>
+      <w:r>
+        <w:t>Parents can edit their own profile and each child's (name, pronouns, age, and the details the app has learned) from Settings. Add-a-kid and delete-a-kid work, with delete cascading the child's data.</w:t>
       </w:r>
     </w:p>
     <w:p>
@@ -1566,10 +1579,18 @@
         <w:rPr>
           <w:b/>
         </w:rPr>
-        <w:t xml:space="preserve">Onboarding polish — open. </w:t>
-      </w:r>
-      <w:r>
-        <w:t>Low-friction, drip-style information collection. Don't ask for everything upfront. Let the app learn the family over time. Greg's WeTransfer insight: one simple action to start.</w:t>
+        <w:t xml:space="preserve">Screen-to-screen navigation. </w:t>
+      </w:r>
+      <w:r>
+        <w:t>The five-tab bottom bar (Home, Library, Coach, Circle, Plan) is always visible and switches instantly—Heather's "toggle seamlessly" and "home base buttons always on bottom" are already how the app is built.</w:t>
+      </w:r>
+    </w:p>
+    <w:p>
+      <w:pPr>
+        <w:pStyle w:val="Heading3"/>
+      </w:pPr>
+      <w:r>
+        <w:t>To build before beta</w:t>
       </w:r>
     </w:p>
     <w:p>
@@ -1577,10 +1598,172 @@
         <w:rPr>
           <w:b/>
         </w:rPr>
-        <w:t xml:space="preserve">Design review &amp; dead ends — open. </w:t>
-      </w:r>
-      <w:r>
-        <w:t>Greg will map the current user journeys in Figma, identify "dead ends" where the user gets stuck, and propose solutions.</w:t>
+        <w:t xml:space="preserve">Log out — blocker. </w:t>
+      </w:r>
+      <w:r>
+        <w:t>The app has no log-out today; the only sign-out lives in a developer-only test screen. A beta user literally cannot leave their account. This is the single most embarrassing gap and ships first. Self-serve "delete my account and data" ships alongside it.</w:t>
+      </w:r>
+    </w:p>
+    <w:p>
+      <w:r>
+        <w:rPr>
+          <w:b/>
+        </w:rPr>
+        <w:t xml:space="preserve">Settings a beta parent should see. </w:t>
+      </w:r>
+      <w:r>
+        <w:t>The current Settings exposes a developer console (server URL, environment switch, thread IDs). Beta parents get a clean Settings—account, connections, help, legal, log out—with the developer tools hidden behind a tap-to-reveal gesture the founders still use.</w:t>
+      </w:r>
+    </w:p>
+    <w:p>
+      <w:r>
+        <w:rPr>
+          <w:b/>
+        </w:rPr>
+        <w:t xml:space="preserve">Get Help. </w:t>
+      </w:r>
+      <w:r>
+        <w:t>The only support path today is a "Send debug data" button buried in the developer screen. Promote it to a first-class "Report a problem" in Settings so beta users have an obvious way to reach us.</w:t>
+      </w:r>
+    </w:p>
+    <w:p>
+      <w:r>
+        <w:rPr>
+          <w:b/>
+        </w:rPr>
+        <w:t xml:space="preserve">Privacy statement + legal. </w:t>
+      </w:r>
+      <w:r>
+        <w:t>Write a real privacy policy and terms of service, publish them on the web dashboard, and link them from the app and the consent screen. Add the self-serve delete control the privacy page already promises. At-rest encryption and formal COPPA counsel are tracked as their own dated phases (see Deferred).</w:t>
+      </w:r>
+    </w:p>
+    <w:p>
+      <w:r>
+        <w:rPr>
+          <w:b/>
+        </w:rPr>
+        <w:t xml:space="preserve">Save / favorite / archive + a Saved tab. </w:t>
+      </w:r>
+      <w:r>
+        <w:t>Nothing outside the activity planner can be saved today. Add a sixth "Saved" tab that collects saved articles, coach answers, community posts, and activities in one place. It doubles as a signal of what each family actually cares about.</w:t>
+      </w:r>
+    </w:p>
+    <w:p>
+      <w:r>
+        <w:rPr>
+          <w:b/>
+        </w:rPr>
+        <w:t xml:space="preserve">A name and symbol for the AI coach. </w:t>
+      </w:r>
+      <w:r>
+        <w:t>The coach has no name and its screen is titled with the literal product name "MVP." Give it a name and a consistent mark (the kid companions each have a name already—it's why they feel like someone). Also fixes the coach's in-chat article links, which are inert today.</w:t>
+      </w:r>
+    </w:p>
+    <w:p>
+      <w:r>
+        <w:rPr>
+          <w:b/>
+        </w:rPr>
+        <w:t xml:space="preserve">Photo profiles + upload. </w:t>
+      </w:r>
+      <w:r>
+        <w:t>Let parents add a photo for themselves and each child. This needs new image storage (the app has none today) and ships behind the legal work, since children's photos raise the stakes on privacy. Photo-library only for beta, no camera.</w:t>
+      </w:r>
+    </w:p>
+    <w:p>
+      <w:r>
+        <w:rPr>
+          <w:b/>
+        </w:rPr>
+        <w:t xml:space="preserve">Welcome-back sign-in. </w:t>
+      </w:r>
+      <w:r>
+        <w:t>A returning user who logs out should be greeted by name on the way back in, not the generic new-user welcome. Small copy change on the existing sign-in.</w:t>
+      </w:r>
+    </w:p>
+    <w:p>
+      <w:r>
+        <w:rPr>
+          <w:b/>
+        </w:rPr>
+        <w:t xml:space="preserve">Notifications — verify + settings. </w:t>
+      </w:r>
+      <w:r>
+        <w:t>First verify crisis and watchlist pushes actually deliver on TestFlight builds (a configuration risk we need to rule out—if wrong, crisis alerts silently fail). Then give parents a place to see and control what they're notified about.</w:t>
+      </w:r>
+    </w:p>
+    <w:p>
+      <w:r>
+        <w:rPr>
+          <w:b/>
+        </w:rPr>
+        <w:t xml:space="preserve">Onboarding refinements. </w:t>
+      </w:r>
+      <w:r>
+        <w:t>Low-friction, drip-style information collection. Don't ask for everything upfront; let the app learn the family over time. Greg's WeTransfer insight: one simple action to start. Greg maps the journeys in Figma and flags dead ends.</w:t>
+      </w:r>
+    </w:p>
+    <w:p>
+      <w:r>
+        <w:rPr>
+          <w:b/>
+        </w:rPr>
+        <w:t xml:space="preserve">TestFlight release of the new experience. </w:t>
+      </w:r>
+      <w:r>
+        <w:t>The five-doors experience (all verticals, the watchlist, the illustrated docs) is live on the production backend and web dashboard; the iOS build that surfaces it (1.66) is built and verified and ships with the next TestFlight upload. Beta phones run the previous build until then—nothing breaks meanwhile.</w:t>
+      </w:r>
+    </w:p>
+    <w:p>
+      <w:pPr>
+        <w:pStyle w:val="Heading3"/>
+      </w:pPr>
+      <w:r>
+        <w:t>Deferred — with a demand test, not a build (confirm in this meeting)</w:t>
+      </w:r>
+    </w:p>
+    <w:p>
+      <w:r>
+        <w:rPr>
+          <w:b/>
+        </w:rPr>
+        <w:t xml:space="preserve">Payments. </w:t>
+      </w:r>
+      <w:r>
+        <w:t>The beta is free for founding families; we validate willingness-to-pay through the funnel in Section 12, not by charging inside the app. Building in-app subscriptions now would pull App Store review, tax, and banking setup onto the critical path for revenue we're not yet collecting. The engineering checklist to turn on charging is captured for when the price is proven.</w:t>
+      </w:r>
+    </w:p>
+    <w:p>
+      <w:r>
+        <w:rPr>
+          <w:b/>
+        </w:rPr>
+        <w:t xml:space="preserve">In-app chat invites + photo sharing between users. </w:t>
+      </w:r>
+      <w:r>
+        <w:t>Heather's "invite users to chat with you / share photos" collides with our own solo-first wedge (Section 12): the second parent gets calendar invites and a magic forwarding email—"never an app install, never an account." True multi-user accounts are a data-model rebuild. We defer the build and instead test whether the demand is real before committing to it.</w:t>
+      </w:r>
+    </w:p>
+    <w:p>
+      <w:r>
+        <w:rPr>
+          <w:b/>
+        </w:rPr>
+        <w:t xml:space="preserve">At-rest encryption. </w:t>
+      </w:r>
+      <w:r>
+        <w:t>The database and its backups are currently plaintext on the host. Encrypting them is its own phase with real production-data risk (a botched cutover loses the volume), so it gets a rehearsed migration, not a rushed one.</w:t>
+      </w:r>
+    </w:p>
+    <w:p>
+      <w:r>
+        <w:rPr>
+          <w:b/>
+        </w:rPr>
+        <w:t xml:space="preserve">COPPA compliance build-out. </w:t>
+      </w:r>
+      <w:r>
+        <w:t>The amended rule is now in force (see Section 12). Required before any public kid-facing launch. The closed beta runs under direct parental consent; the full compliance program is scheduled with counsel.</w:t>
       </w:r>
     </w:p>
     <w:p>
@@ -1647,7 +1830,7 @@
         <w:t xml:space="preserve">Cost controls. </w:t>
       </w:r>
       <w:r>
-        <w:t>Per-family daily spending caps on AI usage. One bored kid overnight should not generate a $4,000 bill.</w:t>
+        <w:t>Per-family daily spending caps on AI usage. No cap exists today—one bored kid overnight could run $4,000–11,000 in model costs. A hard ceiling goes in before the beta cohort grows.</w:t>
       </w:r>
     </w:p>
     <w:p>
@@ -3202,7 +3385,7 @@
         <w:t xml:space="preserve">Early-access cohort. </w:t>
       </w:r>
       <w:r>
-        <w:t>The warmest leads become founding families: a lifetime discount (~$99/yr locked for life vs. $199 standard) in exchange for daily feedback—early product champions, not revenue.</w:t>
+        <w:t>The warmest leads become founding families: a lifetime discount (~$79–99/yr locked vs. the $129–149 standard the test range points to) in exchange for daily feedback—early product champions, not revenue.</w:t>
       </w:r>
     </w:p>
     <w:p>
@@ -3360,7 +3543,7 @@
           <w:color w:val="6F6A60"/>
           <w:sz w:val="20"/>
         </w:rPr>
-        <w:t>MVP — June 2026, rev. July 12, 2026</w:t>
+        <w:t>MVP — June 2026, rev. July 17, 2026</w:t>
       </w:r>
     </w:p>
     <w:sectPr>

</xml_diff>